<commit_message>
Polish paper framing and artifacts
</commit_message>
<xml_diff>
--- a/public/ppo_grpo_opd_long_horizon.docx
+++ b/public/ppo_grpo_opd_long_horizon.docx
@@ -12,7 +12,7 @@
           <w:color w:val="0B2545"/>
           <w:sz w:val="44"/>
         </w:rPr>
-        <w:t>PPO, GRPO, and On-Policy Distillation for Long-Horizon Post-Training</w:t>
+        <w:t>Trajectory Rewards Are Not Token Credit</w:t>
       </w:r>
     </w:p>
     <w:p>
@@ -23,7 +23,7 @@
         <w:rPr>
           <w:i/>
         </w:rPr>
-        <w:t>A Limes Labs public research report on temporal credit assignment</w:t>
+        <w:t>Advantage estimator fidelity for long-horizon post-training</w:t>
       </w:r>
     </w:p>
     <w:p>
@@ -41,7 +41,7 @@
     </w:p>
     <w:p>
       <w:r>
-        <w:t>We compare PPO-style critic/value-model advantage estimation, GRPO-style group-relative advantages, and OPD/OPSD distillation for long-horizon post-training. In a multi-seed toy matrix with known oracle advantages, critic-style TD has the higher mean correlation in 17/18 fixed regimes; a confidence-interval reading gives 16 clear critic-favorable cases, 1 near tie, and 1 clear group-favorable counterexample. The conclusion is conditional: PPO-style critics look better when temporal state information is observable and learnable; GRPO remains attractive when reward contrast is reliable and critic coverage/cost is poor.</w:t>
+        <w:t>We compare PPO-style critic/value-model advantage estimation with GRPO-style group-relative advantages for long-horizon post-training, while situating OPD/OPSD as complementary distillation tools rather than policy-gradient replacements. In a multi-seed toy matrix with known oracle advantages, critic-style TD has the higher mean correlation in 17/18 fixed regimes; a confidence-interval reading gives 16 clear critic-favorable cases, 1 near tie, and 1 clear group-favorable counterexample. Additional audits test anchor-action contrast, coverage-gated credit, and tabular closed-loop training. The conclusion is conditional: PPO-style critics look better when temporal state information is observable and learnable; GRPO remains attractive when reward contrast is reliable and critic coverage/cost is poor.</w:t>
       </w:r>
     </w:p>
     <w:p>
@@ -2012,7 +2012,7 @@
       <w:jc w:val="center"/>
     </w:pPr>
     <w:r>
-      <w:t>Limes Labs | PPO-GRPO-OPD Long-Horizon Workstream</w:t>
+      <w:t>Limes Labs | Long-Horizon Credit Workstream</w:t>
     </w:r>
   </w:p>
 </w:ftr>

</xml_diff>